<commit_message>
feat: regenerate copilot with its brand theme
- render four voices with the brand header band, palette and fonts

🎨 - Generated by Copilot

Co-authored-by: Copilot <223556219+Copilot@users.noreply.github.com>
</commit_message>
<xml_diff>
--- a/projects/copilot/release/outputs/document.docx
+++ b/projects/copilot/release/outputs/document.docx
@@ -585,8 +585,8 @@
   <w:docDefaults>
     <w:rPrDefault>
       <w:rPr>
-        <w:rFonts w:ascii="Arial" w:hAnsi="Arial" w:cs="Arial"/>
-        <w:color w:val="111827"/>
+        <w:rFonts w:ascii="Segoe UI Variable Text" w:hAnsi="Segoe UI Variable Text" w:cs="Segoe UI Variable Text"/>
+        <w:color w:val="071923"/>
         <w:sz w:val="22"/>
       </w:rPr>
     </w:rPrDefault>
@@ -607,13 +607,16 @@
     <w:qFormat/>
     <w:pPr>
       <w:keepNext/>
+      <w:pBdr>
+        <w:bottom w:val="single" w:sz="24" w:space="6" w:color="50E6FF"/>
+      </w:pBdr>
       <w:spacing w:before="0" w:after="240"/>
       <w:jc w:val="left"/>
     </w:pPr>
     <w:rPr>
-      <w:rFonts w:ascii="Arial" w:hAnsi="Arial" w:cs="Arial"/>
+      <w:rFonts w:ascii="Segoe UI Variable Display" w:hAnsi="Segoe UI Variable Display" w:cs="Segoe UI Variable Display"/>
       <w:b/>
-      <w:color w:val="367677"/>
+      <w:color w:val="091F2C"/>
       <w:sz w:val="52"/>
     </w:rPr>
   </w:style>
@@ -628,9 +631,9 @@
       <w:outlineLvl w:val="0"/>
     </w:pPr>
     <w:rPr>
-      <w:rFonts w:ascii="Arial" w:hAnsi="Arial" w:cs="Arial"/>
+      <w:rFonts w:ascii="Segoe UI Variable Display" w:hAnsi="Segoe UI Variable Display" w:cs="Segoe UI Variable Display"/>
       <w:b/>
-      <w:color w:val="367677"/>
+      <w:color w:val="091F2C"/>
       <w:sz w:val="32"/>
     </w:rPr>
   </w:style>
@@ -645,16 +648,16 @@
       <w:outlineLvl w:val="1"/>
     </w:pPr>
     <w:rPr>
-      <w:rFonts w:ascii="Arial" w:hAnsi="Arial" w:cs="Arial"/>
+      <w:rFonts w:ascii="Segoe UI Variable Display" w:hAnsi="Segoe UI Variable Display" w:cs="Segoe UI Variable Display"/>
       <w:b/>
-      <w:color w:val="367677"/>
+      <w:color w:val="091F2C"/>
       <w:sz w:val="24"/>
     </w:rPr>
   </w:style>
   <w:style w:type="character" w:styleId="Hyperlink">
     <w:name w:val="Hyperlink"/>
     <w:rPr>
-      <w:color w:val="0563C1"/>
+      <w:color w:val="006EC3"/>
       <w:u w:val="single"/>
     </w:rPr>
   </w:style>

</xml_diff>